<commit_message>
strip em dashes from the three documents that get sent
Resume, cover letter and 90-day plan are clean, with each dash replaced
by the punctuation the sentence actually wanted rather than a blanket
substitution. Page counts verified after the edits: resume 2, plan 2,
cover letter 1. Source markdown for the resume and plan cleaned to match.

The copies already with Microbac stay as they are; this is for our
records and anything sent from here.
</commit_message>
<xml_diff>
--- a/Applications/2026-09-30 Microbac - Regional Lab Ops Director (Mid-Atlantic)/Evan Parnell - First 90 Days - Baltimore.docx
+++ b/Applications/2026-09-30 Microbac - Regional Lab Ops Director (Mid-Atlantic)/Evan Parnell - First 90 Days - Baltimore.docx
@@ -16,7 +16,7 @@
           <w:sz w:val="30"/>
           <w:szCs w:val="30"/>
         </w:rPr>
-        <w:t xml:space="preserve">FIRST 90 DAYS — BALTIMORE</w:t>
+        <w:t xml:space="preserve">FIRST 90 DAYS: BALTIMORE</w:t>
       </w:r>
     </w:p>
     <w:p>
@@ -50,7 +50,7 @@
           <w:sz w:val="18"/>
           <w:szCs w:val="18"/>
         </w:rPr>
-        <w:t xml:space="preserve">A working outline offered for discussion — it should change once I can see the actual data.</w:t>
+        <w:t xml:space="preserve">A working outline offered for discussion. It should change once I can see the actual data.</w:t>
       </w:r>
     </w:p>
     <w:p>
@@ -70,7 +70,7 @@
           <w:sz w:val="21"/>
           <w:szCs w:val="21"/>
         </w:rPr>
-        <w:t xml:space="preserve">The Thesis — Baltimore, and Only Baltimore</w:t>
+        <w:t xml:space="preserve">The Thesis: Baltimore, and Only Baltimore</w:t>
       </w:r>
     </w:p>
     <w:p>
@@ -83,7 +83,7 @@
           <w:sz w:val="20"/>
           <w:szCs w:val="20"/>
         </w:rPr>
-        <w:t xml:space="preserve">The fastest route to a functioning region is a functioning anchor site. Attention is the scarce resource in a multi-site role, and splitting it early makes every site slower — so the first ninety days are Baltimore: present, characterized, standardized, with one corrective action proven end to end.</w:t>
+        <w:t xml:space="preserve">The fastest route to a functioning region is a functioning anchor site. Attention is the scarce resource in a multi-site role, and splitting it early makes every site slower, so the first ninety days are Baltimore: present, characterized, standardized, with one corrective action proven end to end.</w:t>
       </w:r>
     </w:p>
     <w:p>
@@ -126,7 +126,7 @@
           <w:sz w:val="21"/>
           <w:szCs w:val="21"/>
         </w:rPr>
-        <w:t xml:space="preserve">Phase I · Days 1–30 · Current-State Assessment</w:t>
+        <w:t xml:space="preserve">Phase I · Days 1 to 30 · Current-State Assessment</w:t>
       </w:r>
     </w:p>
     <w:p>
@@ -169,7 +169,7 @@
           <w:sz w:val="20"/>
           <w:szCs w:val="20"/>
         </w:rPr>
-        <w:t xml:space="preserve"> — the default location, not a visit. Time at the bench and in sample receiving, on both shifts if the site runs them.</w:t>
+        <w:t xml:space="preserve">: the default location, not a visit. Time at the bench and in sample receiving, on both shifts if the site runs them.</w:t>
       </w:r>
     </w:p>
     <w:p>
@@ -233,7 +233,7 @@
           <w:sz w:val="20"/>
           <w:szCs w:val="20"/>
         </w:rPr>
-        <w:t xml:space="preserve"> Turnaround especially — received-to-reported versus scheduled-to-reported is where the variance hides.</w:t>
+        <w:t xml:space="preserve"> Turnaround especially: received-to-reported versus scheduled-to-reported is where the variance hides.</w:t>
       </w:r>
     </w:p>
     <w:p>
@@ -294,7 +294,7 @@
           <w:sz w:val="21"/>
           <w:szCs w:val="21"/>
         </w:rPr>
-        <w:t xml:space="preserve">Phase II · Days 31–60 · Gap Analysis and Standard</w:t>
+        <w:t xml:space="preserve">Phase II · Days 31 to 60 · Gap Analysis and Standard</w:t>
       </w:r>
     </w:p>
     <w:p>
@@ -358,7 +358,7 @@
           <w:sz w:val="20"/>
           <w:szCs w:val="20"/>
         </w:rPr>
-        <w:t xml:space="preserve">A monthly management review on a fixed agenda — performance to plan, capacity, quality, people — built so it ports to the other sites later rather than being rebuilt for each one.</w:t>
+        <w:t xml:space="preserve">A monthly management review on a fixed agenda (performance to plan, capacity, quality, people) built so it ports to the other sites later rather than being rebuilt for each one.</w:t>
       </w:r>
     </w:p>
     <w:p>
@@ -386,7 +386,7 @@
           <w:sz w:val="20"/>
           <w:szCs w:val="20"/>
         </w:rPr>
-        <w:t xml:space="preserve"> Setting a target on an unharmonized measure produces reporting behavior rather than improvement — the same reason a method is qualified before its results are trended.</w:t>
+        <w:t xml:space="preserve"> Setting a target on an unharmonized measure produces reporting behavior rather than improvement, the same reason a method is qualified before its results are trended.</w:t>
       </w:r>
     </w:p>
     <w:p>
@@ -414,7 +414,7 @@
           <w:sz w:val="20"/>
           <w:szCs w:val="20"/>
         </w:rPr>
-        <w:t xml:space="preserve"> Where the laboratory performs, the cadence confirms it and gets out of the way. Technical authority stays with the technical leadership holding the licenses — this is an operations exercise, not a scientific one.</w:t>
+        <w:t xml:space="preserve"> Where the laboratory performs, the cadence confirms it and gets out of the way. Technical authority stays with the technical leadership holding the licenses. This is an operations exercise, not a scientific one.</w:t>
       </w:r>
     </w:p>
     <w:p>
@@ -457,25 +457,25 @@
           <w:sz w:val="21"/>
           <w:szCs w:val="21"/>
         </w:rPr>
-        <w:t xml:space="preserve">Phase III · Days 61–90 · Corrective Action and Proof</w:t>
-      </w:r>
-    </w:p>
-    <w:p>
-      <w:pPr>
-        <w:pStyle w:val="ListParagraph"/>
-        <w:numPr>
-          <w:ilvl w:val="0"/>
-          <w:numId w:val="2"/>
-        </w:numPr>
-        <w:spacing w:after="60"/>
-      </w:pPr>
-      <w:r>
-        <w:rPr>
-          <w:rFonts w:ascii="Calibri" w:cs="Calibri" w:eastAsia="Calibri" w:hAnsi="Calibri"/>
-          <w:sz w:val="20"/>
-          <w:szCs w:val="20"/>
-        </w:rPr>
-        <w:t xml:space="preserve">Take the highest-cost finding from Phase I, establish root cause rather than treating the symptom, implement the correction, and define the effectiveness check. In most laboratories this is a turnaround bottleneck — often data review queued behind one or two approvers — or a reanalysis rate nobody has priced.</w:t>
+        <w:t xml:space="preserve">Phase III · Days 61 to 90 · Corrective Action and Proof</w:t>
+      </w:r>
+    </w:p>
+    <w:p>
+      <w:pPr>
+        <w:pStyle w:val="ListParagraph"/>
+        <w:numPr>
+          <w:ilvl w:val="0"/>
+          <w:numId w:val="2"/>
+        </w:numPr>
+        <w:spacing w:after="60"/>
+      </w:pPr>
+      <w:r>
+        <w:rPr>
+          <w:rFonts w:ascii="Calibri" w:cs="Calibri" w:eastAsia="Calibri" w:hAnsi="Calibri"/>
+          <w:sz w:val="20"/>
+          <w:szCs w:val="20"/>
+        </w:rPr>
+        <w:t xml:space="preserve">Take the highest-cost finding from Phase I, establish root cause rather than treating the symptom, implement the correction, and define the effectiveness check. In most laboratories this is a turnaround bottleneck, often data review queued behind one or two approvers, or a reanalysis rate nobody has priced.</w:t>
       </w:r>
     </w:p>
     <w:p>
@@ -564,7 +564,7 @@
           <w:sz w:val="21"/>
           <w:szCs w:val="21"/>
         </w:rPr>
-        <w:t xml:space="preserve">Exit Criteria — What "Fixed" Means</w:t>
+        <w:t xml:space="preserve">Exit Criteria: What "Fixed" Means</w:t>
       </w:r>
     </w:p>
     <w:p>
@@ -659,7 +659,7 @@
           <w:sz w:val="20"/>
           <w:szCs w:val="20"/>
         </w:rPr>
-        <w:t xml:space="preserve"> — the real test, because it means the cadence belongs to them rather than to my presence.</w:t>
+        <w:t xml:space="preserve">, the real test, because it means the cadence belongs to them rather than to my presence.</w:t>
       </w:r>
     </w:p>
     <w:p>
@@ -690,7 +690,7 @@
           <w:sz w:val="20"/>
           <w:szCs w:val="20"/>
         </w:rPr>
-        <w:t xml:space="preserve">When those hold, my time at Baltimore drops from a default to a cadence — and that is what frees the capacity to take on the rest of the region properly.</w:t>
+        <w:t xml:space="preserve">When those hold, my time at Baltimore drops from a default to a cadence, and that is what frees the capacity to take on the rest of the region properly.</w:t>
       </w:r>
     </w:p>
     <w:p>
@@ -723,7 +723,7 @@
           <w:sz w:val="20"/>
           <w:szCs w:val="20"/>
         </w:rPr>
-        <w:t xml:space="preserve">Richmond next, starting light and building — the same format, now proven rather than theoretical. Then the remaining sites on a defined schedule, with every laboratory in the territory visited and characterized by the end of year one. Baltimore stays on the weekly metric set throughout; if it has been done properly, it should not need me in the building to hold.</w:t>
+        <w:t xml:space="preserve">Richmond next, starting light and building, with the same format, now proven rather than theoretical. Then the remaining sites on a defined schedule, with every laboratory in the territory visited and characterized by the end of year one. Baltimore stays on the weekly metric set throughout. If it has been done properly, it should not need me in the building to hold.</w:t>
       </w:r>
     </w:p>
     <w:p>
@@ -779,7 +779,7 @@
           <w:sz w:val="20"/>
           <w:szCs w:val="20"/>
         </w:rPr>
-        <w:t xml:space="preserve">Defined decision rights — what I can approve, and what comes to you first.</w:t>
+        <w:t xml:space="preserve">Defined decision rights: what I can approve, and what comes to you first.</w:t>
       </w:r>
     </w:p>
     <w:p>
@@ -848,7 +848,7 @@
           <w:sz w:val="20"/>
           <w:szCs w:val="20"/>
         </w:rPr>
-        <w:t xml:space="preserve">No reorganization of a functioning team before the root cause is understood. No targets on measures that are not yet agreed. No second site taken on while Baltimore is still unstable. And no trading defensible data for a faster month — a late result is recoverable, a result that does not hold up is not.</w:t>
+        <w:t xml:space="preserve">No reorganization of a functioning team before the root cause is understood. No targets on measures that are not yet agreed. No second site taken on while Baltimore is still unstable. And no trading defensible data for a faster month. A late result is recoverable, a result that does not hold up is not.</w:t>
       </w:r>
     </w:p>
     <w:sectPr>

</xml_diff>